<commit_message>
Updted Contents of files
</commit_message>
<xml_diff>
--- a/Group12_Project_Submission_document_CodeGen.docx
+++ b/Group12_Project_Submission_document_CodeGen.docx
@@ -568,7 +568,7 @@
             </w:rPr>
             <w:fldChar w:fldCharType="separate"/>
           </w:r>
-          <w:hyperlink w:anchor="_Toc220113112" w:history="1">
+          <w:hyperlink w:anchor="_Toc220173070" w:history="1">
             <w:r>
               <w:rPr>
                 <w:rStyle w:val="Hyperlink"/>
@@ -616,7 +616,7 @@
                 <w:noProof/>
                 <w:webHidden/>
               </w:rPr>
-              <w:instrText xml:space="preserve"> PAGEREF _Toc220113112 \h </w:instrText>
+              <w:instrText xml:space="preserve"> PAGEREF _Toc220173070 \h </w:instrText>
             </w:r>
             <w:r>
               <w:rPr>
@@ -662,7 +662,7 @@
               <w14:ligatures w14:val="standardContextual"/>
             </w:rPr>
           </w:pPr>
-          <w:hyperlink w:anchor="_Toc220113113" w:history="1">
+          <w:hyperlink w:anchor="_Toc220173071" w:history="1">
             <w:r>
               <w:rPr>
                 <w:rStyle w:val="Hyperlink"/>
@@ -710,7 +710,7 @@
                 <w:noProof/>
                 <w:webHidden/>
               </w:rPr>
-              <w:instrText xml:space="preserve"> PAGEREF _Toc220113113 \h </w:instrText>
+              <w:instrText xml:space="preserve"> PAGEREF _Toc220173071 \h </w:instrText>
             </w:r>
             <w:r>
               <w:rPr>
@@ -756,7 +756,7 @@
               <w14:ligatures w14:val="standardContextual"/>
             </w:rPr>
           </w:pPr>
-          <w:hyperlink w:anchor="_Toc220113114" w:history="1">
+          <w:hyperlink w:anchor="_Toc220173072" w:history="1">
             <w:r>
               <w:rPr>
                 <w:rStyle w:val="Hyperlink"/>
@@ -804,7 +804,7 @@
                 <w:noProof/>
                 <w:webHidden/>
               </w:rPr>
-              <w:instrText xml:space="preserve"> PAGEREF _Toc220113114 \h </w:instrText>
+              <w:instrText xml:space="preserve"> PAGEREF _Toc220173072 \h </w:instrText>
             </w:r>
             <w:r>
               <w:rPr>
@@ -852,7 +852,7 @@
               <w14:ligatures w14:val="standardContextual"/>
             </w:rPr>
           </w:pPr>
-          <w:hyperlink w:anchor="_Toc220113115" w:history="1">
+          <w:hyperlink w:anchor="_Toc220173073" w:history="1">
             <w:r>
               <w:rPr>
                 <w:rStyle w:val="Hyperlink"/>
@@ -898,7 +898,7 @@
                 <w:noProof/>
                 <w:webHidden/>
               </w:rPr>
-              <w:instrText xml:space="preserve"> PAGEREF _Toc220113115 \h </w:instrText>
+              <w:instrText xml:space="preserve"> PAGEREF _Toc220173073 \h </w:instrText>
             </w:r>
             <w:r>
               <w:rPr>
@@ -946,7 +946,7 @@
               <w14:ligatures w14:val="standardContextual"/>
             </w:rPr>
           </w:pPr>
-          <w:hyperlink w:anchor="_Toc220113116" w:history="1">
+          <w:hyperlink w:anchor="_Toc220173074" w:history="1">
             <w:r>
               <w:rPr>
                 <w:rStyle w:val="Hyperlink"/>
@@ -992,7 +992,7 @@
                 <w:noProof/>
                 <w:webHidden/>
               </w:rPr>
-              <w:instrText xml:space="preserve"> PAGEREF _Toc220113116 \h </w:instrText>
+              <w:instrText xml:space="preserve"> PAGEREF _Toc220173074 \h </w:instrText>
             </w:r>
             <w:r>
               <w:rPr>
@@ -1038,7 +1038,7 @@
               <w14:ligatures w14:val="standardContextual"/>
             </w:rPr>
           </w:pPr>
-          <w:hyperlink w:anchor="_Toc220113117" w:history="1">
+          <w:hyperlink w:anchor="_Toc220173075" w:history="1">
             <w:r>
               <w:rPr>
                 <w:rStyle w:val="Hyperlink"/>
@@ -1086,7 +1086,7 @@
                 <w:noProof/>
                 <w:webHidden/>
               </w:rPr>
-              <w:instrText xml:space="preserve"> PAGEREF _Toc220113117 \h </w:instrText>
+              <w:instrText xml:space="preserve"> PAGEREF _Toc220173075 \h </w:instrText>
             </w:r>
             <w:r>
               <w:rPr>
@@ -1132,7 +1132,7 @@
               <w14:ligatures w14:val="standardContextual"/>
             </w:rPr>
           </w:pPr>
-          <w:hyperlink w:anchor="_Toc220113118" w:history="1">
+          <w:hyperlink w:anchor="_Toc220173076" w:history="1">
             <w:r>
               <w:rPr>
                 <w:rStyle w:val="Hyperlink"/>
@@ -1180,7 +1180,7 @@
                 <w:noProof/>
                 <w:webHidden/>
               </w:rPr>
-              <w:instrText xml:space="preserve"> PAGEREF _Toc220113118 \h </w:instrText>
+              <w:instrText xml:space="preserve"> PAGEREF _Toc220173076 \h </w:instrText>
             </w:r>
             <w:r>
               <w:rPr>
@@ -1227,7 +1227,7 @@
               <w14:ligatures w14:val="standardContextual"/>
             </w:rPr>
           </w:pPr>
-          <w:hyperlink w:anchor="_Toc220113119" w:history="1">
+          <w:hyperlink w:anchor="_Toc220173077" w:history="1">
             <w:r>
               <w:rPr>
                 <w:rStyle w:val="Hyperlink"/>
@@ -1254,7 +1254,7 @@
                 <w:noProof/>
                 <w:webHidden/>
               </w:rPr>
-              <w:instrText xml:space="preserve"> PAGEREF _Toc220113119 \h </w:instrText>
+              <w:instrText xml:space="preserve"> PAGEREF _Toc220173077 \h </w:instrText>
             </w:r>
             <w:r>
               <w:rPr>
@@ -1301,7 +1301,7 @@
               <w14:ligatures w14:val="standardContextual"/>
             </w:rPr>
           </w:pPr>
-          <w:hyperlink w:anchor="_Toc220113120" w:history="1">
+          <w:hyperlink w:anchor="_Toc220173078" w:history="1">
             <w:r>
               <w:rPr>
                 <w:rStyle w:val="Hyperlink"/>
@@ -1328,7 +1328,7 @@
                 <w:noProof/>
                 <w:webHidden/>
               </w:rPr>
-              <w:instrText xml:space="preserve"> PAGEREF _Toc220113120 \h </w:instrText>
+              <w:instrText xml:space="preserve"> PAGEREF _Toc220173078 \h </w:instrText>
             </w:r>
             <w:r>
               <w:rPr>
@@ -1375,7 +1375,7 @@
               <w14:ligatures w14:val="standardContextual"/>
             </w:rPr>
           </w:pPr>
-          <w:hyperlink w:anchor="_Toc220113121" w:history="1">
+          <w:hyperlink w:anchor="_Toc220173079" w:history="1">
             <w:r>
               <w:rPr>
                 <w:rStyle w:val="Hyperlink"/>
@@ -1402,7 +1402,7 @@
                 <w:noProof/>
                 <w:webHidden/>
               </w:rPr>
-              <w:instrText xml:space="preserve"> PAGEREF _Toc220113121 \h </w:instrText>
+              <w:instrText xml:space="preserve"> PAGEREF _Toc220173079 \h </w:instrText>
             </w:r>
             <w:r>
               <w:rPr>
@@ -1449,7 +1449,7 @@
               <w14:ligatures w14:val="standardContextual"/>
             </w:rPr>
           </w:pPr>
-          <w:hyperlink w:anchor="_Toc220113122" w:history="1">
+          <w:hyperlink w:anchor="_Toc220173080" w:history="1">
             <w:r>
               <w:rPr>
                 <w:rStyle w:val="Hyperlink"/>
@@ -1476,7 +1476,7 @@
                 <w:noProof/>
                 <w:webHidden/>
               </w:rPr>
-              <w:instrText xml:space="preserve"> PAGEREF _Toc220113122 \h </w:instrText>
+              <w:instrText xml:space="preserve"> PAGEREF _Toc220173080 \h </w:instrText>
             </w:r>
             <w:r>
               <w:rPr>
@@ -1522,7 +1522,7 @@
               <w14:ligatures w14:val="standardContextual"/>
             </w:rPr>
           </w:pPr>
-          <w:hyperlink w:anchor="_Toc220113123" w:history="1">
+          <w:hyperlink w:anchor="_Toc220173081" w:history="1">
             <w:r>
               <w:rPr>
                 <w:rStyle w:val="Hyperlink"/>
@@ -1570,7 +1570,7 @@
                 <w:noProof/>
                 <w:webHidden/>
               </w:rPr>
-              <w:instrText xml:space="preserve"> PAGEREF _Toc220113123 \h </w:instrText>
+              <w:instrText xml:space="preserve"> PAGEREF _Toc220173081 \h </w:instrText>
             </w:r>
             <w:r>
               <w:rPr>
@@ -1617,7 +1617,7 @@
               <w14:ligatures w14:val="standardContextual"/>
             </w:rPr>
           </w:pPr>
-          <w:hyperlink w:anchor="_Toc220113124" w:history="1">
+          <w:hyperlink w:anchor="_Toc220173082" w:history="1">
             <w:r>
               <w:rPr>
                 <w:rStyle w:val="Hyperlink"/>
@@ -1644,7 +1644,7 @@
                 <w:noProof/>
                 <w:webHidden/>
               </w:rPr>
-              <w:instrText xml:space="preserve"> PAGEREF _Toc220113124 \h </w:instrText>
+              <w:instrText xml:space="preserve"> PAGEREF _Toc220173082 \h </w:instrText>
             </w:r>
             <w:r>
               <w:rPr>
@@ -1691,7 +1691,7 @@
               <w14:ligatures w14:val="standardContextual"/>
             </w:rPr>
           </w:pPr>
-          <w:hyperlink w:anchor="_Toc220113125" w:history="1">
+          <w:hyperlink w:anchor="_Toc220173083" w:history="1">
             <w:r>
               <w:rPr>
                 <w:rStyle w:val="Hyperlink"/>
@@ -1718,7 +1718,7 @@
                 <w:noProof/>
                 <w:webHidden/>
               </w:rPr>
-              <w:instrText xml:space="preserve"> PAGEREF _Toc220113125 \h </w:instrText>
+              <w:instrText xml:space="preserve"> PAGEREF _Toc220173083 \h </w:instrText>
             </w:r>
             <w:r>
               <w:rPr>
@@ -1765,7 +1765,7 @@
               <w14:ligatures w14:val="standardContextual"/>
             </w:rPr>
           </w:pPr>
-          <w:hyperlink w:anchor="_Toc220113126" w:history="1">
+          <w:hyperlink w:anchor="_Toc220173084" w:history="1">
             <w:r>
               <w:rPr>
                 <w:rStyle w:val="Hyperlink"/>
@@ -1792,7 +1792,7 @@
                 <w:noProof/>
                 <w:webHidden/>
               </w:rPr>
-              <w:instrText xml:space="preserve"> PAGEREF _Toc220113126 \h </w:instrText>
+              <w:instrText xml:space="preserve"> PAGEREF _Toc220173084 \h </w:instrText>
             </w:r>
             <w:r>
               <w:rPr>
@@ -1839,7 +1839,7 @@
               <w14:ligatures w14:val="standardContextual"/>
             </w:rPr>
           </w:pPr>
-          <w:hyperlink w:anchor="_Toc220113127" w:history="1">
+          <w:hyperlink w:anchor="_Toc220173085" w:history="1">
             <w:r>
               <w:rPr>
                 <w:rStyle w:val="Hyperlink"/>
@@ -1866,7 +1866,7 @@
                 <w:noProof/>
                 <w:webHidden/>
               </w:rPr>
-              <w:instrText xml:space="preserve"> PAGEREF _Toc220113127 \h </w:instrText>
+              <w:instrText xml:space="preserve"> PAGEREF _Toc220173085 \h </w:instrText>
             </w:r>
             <w:r>
               <w:rPr>
@@ -1913,7 +1913,7 @@
               <w14:ligatures w14:val="standardContextual"/>
             </w:rPr>
           </w:pPr>
-          <w:hyperlink w:anchor="_Toc220113128" w:history="1">
+          <w:hyperlink w:anchor="_Toc220173086" w:history="1">
             <w:r>
               <w:rPr>
                 <w:rStyle w:val="Hyperlink"/>
@@ -1940,7 +1940,7 @@
                 <w:noProof/>
                 <w:webHidden/>
               </w:rPr>
-              <w:instrText xml:space="preserve"> PAGEREF _Toc220113128 \h </w:instrText>
+              <w:instrText xml:space="preserve"> PAGEREF _Toc220173086 \h </w:instrText>
             </w:r>
             <w:r>
               <w:rPr>
@@ -1960,7 +1960,7 @@
                 <w:noProof/>
                 <w:webHidden/>
               </w:rPr>
-              <w:t>9</w:t>
+              <w:t>10</w:t>
             </w:r>
             <w:r>
               <w:rPr>
@@ -1986,7 +1986,7 @@
               <w14:ligatures w14:val="standardContextual"/>
             </w:rPr>
           </w:pPr>
-          <w:hyperlink w:anchor="_Toc220113129" w:history="1">
+          <w:hyperlink w:anchor="_Toc220173087" w:history="1">
             <w:r>
               <w:rPr>
                 <w:rStyle w:val="Hyperlink"/>
@@ -2034,7 +2034,7 @@
                 <w:noProof/>
                 <w:webHidden/>
               </w:rPr>
-              <w:instrText xml:space="preserve"> PAGEREF _Toc220113129 \h </w:instrText>
+              <w:instrText xml:space="preserve"> PAGEREF _Toc220173087 \h </w:instrText>
             </w:r>
             <w:r>
               <w:rPr>
@@ -2081,7 +2081,7 @@
               <w14:ligatures w14:val="standardContextual"/>
             </w:rPr>
           </w:pPr>
-          <w:hyperlink w:anchor="_Toc220113130" w:history="1">
+          <w:hyperlink w:anchor="_Toc220173088" w:history="1">
             <w:r>
               <w:rPr>
                 <w:rStyle w:val="Hyperlink"/>
@@ -2108,7 +2108,7 @@
                 <w:noProof/>
                 <w:webHidden/>
               </w:rPr>
-              <w:instrText xml:space="preserve"> PAGEREF _Toc220113130 \h </w:instrText>
+              <w:instrText xml:space="preserve"> PAGEREF _Toc220173088 \h </w:instrText>
             </w:r>
             <w:r>
               <w:rPr>
@@ -2128,7 +2128,7 @@
                 <w:noProof/>
                 <w:webHidden/>
               </w:rPr>
-              <w:t>10</w:t>
+              <w:t>11</w:t>
             </w:r>
             <w:r>
               <w:rPr>
@@ -2155,7 +2155,7 @@
               <w14:ligatures w14:val="standardContextual"/>
             </w:rPr>
           </w:pPr>
-          <w:hyperlink w:anchor="_Toc220113131" w:history="1">
+          <w:hyperlink w:anchor="_Toc220173089" w:history="1">
             <w:r>
               <w:rPr>
                 <w:rStyle w:val="Hyperlink"/>
@@ -2182,7 +2182,7 @@
                 <w:noProof/>
                 <w:webHidden/>
               </w:rPr>
-              <w:instrText xml:space="preserve"> PAGEREF _Toc220113131 \h </w:instrText>
+              <w:instrText xml:space="preserve"> PAGEREF _Toc220173089 \h </w:instrText>
             </w:r>
             <w:r>
               <w:rPr>
@@ -2202,7 +2202,7 @@
                 <w:noProof/>
                 <w:webHidden/>
               </w:rPr>
-              <w:t>10</w:t>
+              <w:t>11</w:t>
             </w:r>
             <w:r>
               <w:rPr>
@@ -2229,7 +2229,7 @@
               <w14:ligatures w14:val="standardContextual"/>
             </w:rPr>
           </w:pPr>
-          <w:hyperlink w:anchor="_Toc220113132" w:history="1">
+          <w:hyperlink w:anchor="_Toc220173090" w:history="1">
             <w:r>
               <w:rPr>
                 <w:rStyle w:val="Hyperlink"/>
@@ -2256,7 +2256,7 @@
                 <w:noProof/>
                 <w:webHidden/>
               </w:rPr>
-              <w:instrText xml:space="preserve"> PAGEREF _Toc220113132 \h </w:instrText>
+              <w:instrText xml:space="preserve"> PAGEREF _Toc220173090 \h </w:instrText>
             </w:r>
             <w:r>
               <w:rPr>
@@ -2303,7 +2303,7 @@
               <w14:ligatures w14:val="standardContextual"/>
             </w:rPr>
           </w:pPr>
-          <w:hyperlink w:anchor="_Toc220113133" w:history="1">
+          <w:hyperlink w:anchor="_Toc220173091" w:history="1">
             <w:r>
               <w:rPr>
                 <w:rStyle w:val="Hyperlink"/>
@@ -2330,7 +2330,7 @@
                 <w:noProof/>
                 <w:webHidden/>
               </w:rPr>
-              <w:instrText xml:space="preserve"> PAGEREF _Toc220113133 \h </w:instrText>
+              <w:instrText xml:space="preserve"> PAGEREF _Toc220173091 \h </w:instrText>
             </w:r>
             <w:r>
               <w:rPr>
@@ -2350,7 +2350,7 @@
                 <w:noProof/>
                 <w:webHidden/>
               </w:rPr>
-              <w:t>11</w:t>
+              <w:t>12</w:t>
             </w:r>
             <w:r>
               <w:rPr>
@@ -2376,7 +2376,7 @@
               <w14:ligatures w14:val="standardContextual"/>
             </w:rPr>
           </w:pPr>
-          <w:hyperlink w:anchor="_Toc220113134" w:history="1">
+          <w:hyperlink w:anchor="_Toc220173092" w:history="1">
             <w:r>
               <w:rPr>
                 <w:rStyle w:val="Hyperlink"/>
@@ -2424,7 +2424,7 @@
                 <w:noProof/>
                 <w:webHidden/>
               </w:rPr>
-              <w:instrText xml:space="preserve"> PAGEREF _Toc220113134 \h </w:instrText>
+              <w:instrText xml:space="preserve"> PAGEREF _Toc220173092 \h </w:instrText>
             </w:r>
             <w:r>
               <w:rPr>
@@ -2444,7 +2444,7 @@
                 <w:noProof/>
                 <w:webHidden/>
               </w:rPr>
-              <w:t>11</w:t>
+              <w:t>12</w:t>
             </w:r>
             <w:r>
               <w:rPr>
@@ -2471,7 +2471,7 @@
               <w14:ligatures w14:val="standardContextual"/>
             </w:rPr>
           </w:pPr>
-          <w:hyperlink w:anchor="_Toc220113135" w:history="1">
+          <w:hyperlink w:anchor="_Toc220173093" w:history="1">
             <w:r>
               <w:rPr>
                 <w:rStyle w:val="Hyperlink"/>
@@ -2498,7 +2498,7 @@
                 <w:noProof/>
                 <w:webHidden/>
               </w:rPr>
-              <w:instrText xml:space="preserve"> PAGEREF _Toc220113135 \h </w:instrText>
+              <w:instrText xml:space="preserve"> PAGEREF _Toc220173093 \h </w:instrText>
             </w:r>
             <w:r>
               <w:rPr>
@@ -2518,7 +2518,7 @@
                 <w:noProof/>
                 <w:webHidden/>
               </w:rPr>
-              <w:t>11</w:t>
+              <w:t>12</w:t>
             </w:r>
             <w:r>
               <w:rPr>
@@ -2545,7 +2545,7 @@
               <w14:ligatures w14:val="standardContextual"/>
             </w:rPr>
           </w:pPr>
-          <w:hyperlink w:anchor="_Toc220113136" w:history="1">
+          <w:hyperlink w:anchor="_Toc220173094" w:history="1">
             <w:r>
               <w:rPr>
                 <w:rStyle w:val="Hyperlink"/>
@@ -2572,7 +2572,7 @@
                 <w:noProof/>
                 <w:webHidden/>
               </w:rPr>
-              <w:instrText xml:space="preserve"> PAGEREF _Toc220113136 \h </w:instrText>
+              <w:instrText xml:space="preserve"> PAGEREF _Toc220173094 \h </w:instrText>
             </w:r>
             <w:r>
               <w:rPr>
@@ -2592,7 +2592,7 @@
                 <w:noProof/>
                 <w:webHidden/>
               </w:rPr>
-              <w:t>12</w:t>
+              <w:t>13</w:t>
             </w:r>
             <w:r>
               <w:rPr>
@@ -2619,7 +2619,7 @@
               <w14:ligatures w14:val="standardContextual"/>
             </w:rPr>
           </w:pPr>
-          <w:hyperlink w:anchor="_Toc220113137" w:history="1">
+          <w:hyperlink w:anchor="_Toc220173095" w:history="1">
             <w:r>
               <w:rPr>
                 <w:rStyle w:val="Hyperlink"/>
@@ -2646,7 +2646,7 @@
                 <w:noProof/>
                 <w:webHidden/>
               </w:rPr>
-              <w:instrText xml:space="preserve"> PAGEREF _Toc220113137 \h </w:instrText>
+              <w:instrText xml:space="preserve"> PAGEREF _Toc220173095 \h </w:instrText>
             </w:r>
             <w:r>
               <w:rPr>
@@ -2666,7 +2666,7 @@
                 <w:noProof/>
                 <w:webHidden/>
               </w:rPr>
-              <w:t>12</w:t>
+              <w:t>13</w:t>
             </w:r>
             <w:r>
               <w:rPr>
@@ -2694,7 +2694,7 @@
               <w14:ligatures w14:val="standardContextual"/>
             </w:rPr>
           </w:pPr>
-          <w:hyperlink w:anchor="_Toc220113138" w:history="1">
+          <w:hyperlink w:anchor="_Toc220173096" w:history="1">
             <w:r>
               <w:rPr>
                 <w:rStyle w:val="Hyperlink"/>
@@ -2721,7 +2721,7 @@
                 <w:noProof/>
                 <w:webHidden/>
               </w:rPr>
-              <w:instrText xml:space="preserve"> PAGEREF _Toc220113138 \h </w:instrText>
+              <w:instrText xml:space="preserve"> PAGEREF _Toc220173096 \h </w:instrText>
             </w:r>
             <w:r>
               <w:rPr>
@@ -2741,7 +2741,7 @@
                 <w:noProof/>
                 <w:webHidden/>
               </w:rPr>
-              <w:t>12</w:t>
+              <w:t>13</w:t>
             </w:r>
             <w:r>
               <w:rPr>
@@ -2769,7 +2769,7 @@
               <w14:ligatures w14:val="standardContextual"/>
             </w:rPr>
           </w:pPr>
-          <w:hyperlink w:anchor="_Toc220113139" w:history="1">
+          <w:hyperlink w:anchor="_Toc220173097" w:history="1">
             <w:r>
               <w:rPr>
                 <w:rStyle w:val="Hyperlink"/>
@@ -2796,7 +2796,7 @@
                 <w:noProof/>
                 <w:webHidden/>
               </w:rPr>
-              <w:instrText xml:space="preserve"> PAGEREF _Toc220113139 \h </w:instrText>
+              <w:instrText xml:space="preserve"> PAGEREF _Toc220173097 \h </w:instrText>
             </w:r>
             <w:r>
               <w:rPr>
@@ -2816,7 +2816,7 @@
                 <w:noProof/>
                 <w:webHidden/>
               </w:rPr>
-              <w:t>13</w:t>
+              <w:t>14</w:t>
             </w:r>
             <w:r>
               <w:rPr>
@@ -2844,7 +2844,7 @@
               <w14:ligatures w14:val="standardContextual"/>
             </w:rPr>
           </w:pPr>
-          <w:hyperlink w:anchor="_Toc220113140" w:history="1">
+          <w:hyperlink w:anchor="_Toc220173098" w:history="1">
             <w:r>
               <w:rPr>
                 <w:rStyle w:val="Hyperlink"/>
@@ -2871,7 +2871,7 @@
                 <w:noProof/>
                 <w:webHidden/>
               </w:rPr>
-              <w:instrText xml:space="preserve"> PAGEREF _Toc220113140 \h </w:instrText>
+              <w:instrText xml:space="preserve"> PAGEREF _Toc220173098 \h </w:instrText>
             </w:r>
             <w:r>
               <w:rPr>
@@ -2891,7 +2891,7 @@
                 <w:noProof/>
                 <w:webHidden/>
               </w:rPr>
-              <w:t>13</w:t>
+              <w:t>14</w:t>
             </w:r>
             <w:r>
               <w:rPr>
@@ -2917,7 +2917,7 @@
               <w14:ligatures w14:val="standardContextual"/>
             </w:rPr>
           </w:pPr>
-          <w:hyperlink w:anchor="_Toc220113141" w:history="1">
+          <w:hyperlink w:anchor="_Toc220173099" w:history="1">
             <w:r>
               <w:rPr>
                 <w:rStyle w:val="Hyperlink"/>
@@ -2965,7 +2965,7 @@
                 <w:noProof/>
                 <w:webHidden/>
               </w:rPr>
-              <w:instrText xml:space="preserve"> PAGEREF _Toc220113141 \h </w:instrText>
+              <w:instrText xml:space="preserve"> PAGEREF _Toc220173099 \h </w:instrText>
             </w:r>
             <w:r>
               <w:rPr>
@@ -2985,7 +2985,7 @@
                 <w:noProof/>
                 <w:webHidden/>
               </w:rPr>
-              <w:t>14</w:t>
+              <w:t>16</w:t>
             </w:r>
             <w:r>
               <w:rPr>
@@ -3011,7 +3011,7 @@
               <w14:ligatures w14:val="standardContextual"/>
             </w:rPr>
           </w:pPr>
-          <w:hyperlink w:anchor="_Toc220113142" w:history="1">
+          <w:hyperlink w:anchor="_Toc220173100" w:history="1">
             <w:r>
               <w:rPr>
                 <w:rStyle w:val="Hyperlink"/>
@@ -3059,7 +3059,7 @@
                 <w:noProof/>
                 <w:webHidden/>
               </w:rPr>
-              <w:instrText xml:space="preserve"> PAGEREF _Toc220113142 \h </w:instrText>
+              <w:instrText xml:space="preserve"> PAGEREF _Toc220173100 \h </w:instrText>
             </w:r>
             <w:r>
               <w:rPr>
@@ -3079,7 +3079,7 @@
                 <w:noProof/>
                 <w:webHidden/>
               </w:rPr>
-              <w:t>15</w:t>
+              <w:t>18</w:t>
             </w:r>
             <w:r>
               <w:rPr>
@@ -3105,7 +3105,7 @@
               <w14:ligatures w14:val="standardContextual"/>
             </w:rPr>
           </w:pPr>
-          <w:hyperlink w:anchor="_Toc220113143" w:history="1">
+          <w:hyperlink w:anchor="_Toc220173101" w:history="1">
             <w:r>
               <w:rPr>
                 <w:rStyle w:val="Hyperlink"/>
@@ -3153,7 +3153,7 @@
                 <w:noProof/>
                 <w:webHidden/>
               </w:rPr>
-              <w:instrText xml:space="preserve"> PAGEREF _Toc220113143 \h </w:instrText>
+              <w:instrText xml:space="preserve"> PAGEREF _Toc220173101 \h </w:instrText>
             </w:r>
             <w:r>
               <w:rPr>
@@ -3173,7 +3173,7 @@
                 <w:noProof/>
                 <w:webHidden/>
               </w:rPr>
-              <w:t>16</w:t>
+              <w:t>19</w:t>
             </w:r>
             <w:r>
               <w:rPr>
@@ -3199,7 +3199,7 @@
               <w14:ligatures w14:val="standardContextual"/>
             </w:rPr>
           </w:pPr>
-          <w:hyperlink w:anchor="_Toc220113144" w:history="1">
+          <w:hyperlink w:anchor="_Toc220173102" w:history="1">
             <w:r>
               <w:rPr>
                 <w:rStyle w:val="Hyperlink"/>
@@ -3247,7 +3247,7 @@
                 <w:noProof/>
                 <w:webHidden/>
               </w:rPr>
-              <w:instrText xml:space="preserve"> PAGEREF _Toc220113144 \h </w:instrText>
+              <w:instrText xml:space="preserve"> PAGEREF _Toc220173102 \h </w:instrText>
             </w:r>
             <w:r>
               <w:rPr>
@@ -3267,7 +3267,7 @@
                 <w:noProof/>
                 <w:webHidden/>
               </w:rPr>
-              <w:t>17</w:t>
+              <w:t>19</w:t>
             </w:r>
             <w:r>
               <w:rPr>
@@ -3331,7 +3331,7 @@
         </w:numPr>
         <w:jc w:val="both"/>
       </w:pPr>
-      <w:bookmarkStart w:id="0" w:name="_Toc220113112"/>
+      <w:bookmarkStart w:id="0" w:name="_Toc220173070"/>
       <w:r>
         <w:t>Abstract</w:t>
       </w:r>
@@ -3380,7 +3380,7 @@
           <w:numId w:val="1"/>
         </w:numPr>
       </w:pPr>
-      <w:bookmarkStart w:id="1" w:name="_Toc220113113"/>
+      <w:bookmarkStart w:id="1" w:name="_Toc220173071"/>
       <w:r>
         <w:t>Introduction</w:t>
       </w:r>
@@ -3451,7 +3451,7 @@
           <w:numId w:val="1"/>
         </w:numPr>
       </w:pPr>
-      <w:bookmarkStart w:id="2" w:name="_Toc220113114"/>
+      <w:bookmarkStart w:id="2" w:name="_Toc220173072"/>
       <w:r>
         <w:t>Problem Statement</w:t>
       </w:r>
@@ -3465,7 +3465,7 @@
           <w:numId w:val="1"/>
         </w:numPr>
       </w:pPr>
-      <w:bookmarkStart w:id="3" w:name="_Toc220113115"/>
+      <w:bookmarkStart w:id="3" w:name="_Toc220173073"/>
       <w:r>
         <w:t>Natural Language to SQL Translation</w:t>
       </w:r>
@@ -3507,7 +3507,7 @@
       <w:r>
         <w:t xml:space="preserve"> </w:t>
       </w:r>
-      <w:bookmarkStart w:id="4" w:name="_Toc220113116"/>
+      <w:bookmarkStart w:id="4" w:name="_Toc220173074"/>
       <w:r>
         <w:t>SQL to NoSQL Translation</w:t>
       </w:r>
@@ -3540,7 +3540,7 @@
           <w:numId w:val="1"/>
         </w:numPr>
       </w:pPr>
-      <w:bookmarkStart w:id="5" w:name="_Toc220113117"/>
+      <w:bookmarkStart w:id="5" w:name="_Toc220173075"/>
       <w:r>
         <w:lastRenderedPageBreak/>
         <w:t>Project Objectives</w:t>
@@ -3690,7 +3690,7 @@
           <w:rFonts w:eastAsiaTheme="minorEastAsia"/>
         </w:rPr>
       </w:pPr>
-      <w:bookmarkStart w:id="6" w:name="_Toc220113118"/>
+      <w:bookmarkStart w:id="6" w:name="_Toc220173076"/>
       <w:r>
         <w:rPr>
           <w:rFonts w:eastAsiaTheme="minorEastAsia"/>
@@ -3714,7 +3714,7 @@
           <w:szCs w:val="27"/>
         </w:rPr>
       </w:pPr>
-      <w:bookmarkStart w:id="7" w:name="_Toc220113119"/>
+      <w:bookmarkStart w:id="7" w:name="_Toc220173077"/>
       <w:r>
         <w:rPr>
           <w:rStyle w:val="Strong"/>
@@ -3745,7 +3745,7 @@
       <w:pPr>
         <w:pStyle w:val="Heading2"/>
       </w:pPr>
-      <w:bookmarkStart w:id="8" w:name="_Toc220113120"/>
+      <w:bookmarkStart w:id="8" w:name="_Toc220173078"/>
       <w:r>
         <w:rPr>
           <w:rStyle w:val="Strong"/>
@@ -3803,7 +3803,7 @@
       <w:pPr>
         <w:pStyle w:val="Heading2"/>
       </w:pPr>
-      <w:bookmarkStart w:id="9" w:name="_Toc220113121"/>
+      <w:bookmarkStart w:id="9" w:name="_Toc220173079"/>
       <w:r>
         <w:rPr>
           <w:rStyle w:val="Strong"/>
@@ -3850,7 +3850,7 @@
       <w:pPr>
         <w:pStyle w:val="Heading2"/>
       </w:pPr>
-      <w:bookmarkStart w:id="10" w:name="_Toc220113122"/>
+      <w:bookmarkStart w:id="10" w:name="_Toc220173080"/>
       <w:r>
         <w:rPr>
           <w:rStyle w:val="Strong"/>
@@ -3907,7 +3907,7 @@
           <w:rFonts w:eastAsiaTheme="minorEastAsia"/>
         </w:rPr>
       </w:pPr>
-      <w:bookmarkStart w:id="11" w:name="_Toc220113123"/>
+      <w:bookmarkStart w:id="11" w:name="_Toc220173081"/>
       <w:r>
         <w:rPr>
           <w:rFonts w:eastAsiaTheme="minorEastAsia"/>
@@ -3925,7 +3925,7 @@
           <w:szCs w:val="27"/>
         </w:rPr>
       </w:pPr>
-      <w:bookmarkStart w:id="12" w:name="_Toc220113124"/>
+      <w:bookmarkStart w:id="12" w:name="_Toc220173082"/>
       <w:r>
         <w:rPr>
           <w:rStyle w:val="Strong"/>
@@ -3986,9 +3986,112 @@
     </w:p>
     <w:p>
       <w:pPr>
+        <w:pStyle w:val="NormalWeb"/>
+        <w:rPr>
+          <w:rFonts w:asciiTheme="minorHAnsi" w:eastAsiaTheme="minorEastAsia" w:hAnsiTheme="minorHAnsi" w:cstheme="minorBidi"/>
+          <w:lang w:eastAsia="en-US"/>
+        </w:rPr>
+      </w:pPr>
+    </w:p>
+    <w:p>
+      <w:pPr>
+        <w:pStyle w:val="NormalWeb"/>
+        <w:rPr>
+          <w:rFonts w:asciiTheme="minorHAnsi" w:eastAsiaTheme="minorEastAsia" w:hAnsiTheme="minorHAnsi" w:cstheme="minorBidi"/>
+          <w:lang w:eastAsia="en-US"/>
+        </w:rPr>
+      </w:pPr>
+      <w:r>
+        <w:rPr>
+          <w:rFonts w:asciiTheme="minorHAnsi" w:eastAsiaTheme="minorEastAsia" w:hAnsiTheme="minorHAnsi" w:cstheme="minorBidi"/>
+          <w:lang w:eastAsia="en-US"/>
+        </w:rPr>
+        <w:drawing>
+          <wp:inline distT="0" distB="0" distL="0" distR="0" wp14:anchorId="5BE8FE79" wp14:editId="465025F6">
+            <wp:extent cx="5731510" cy="2156460"/>
+            <wp:effectExtent l="0" t="0" r="0" b="2540"/>
+            <wp:docPr id="10" name="Picture 9" descr="A diagram of a company&#10;&#10;AI-generated content may be incorrect.">
+              <a:extLst xmlns:a="http://schemas.openxmlformats.org/drawingml/2006/main">
+                <a:ext uri="{FF2B5EF4-FFF2-40B4-BE49-F238E27FC236}">
+                  <a16:creationId xmlns:a16="http://schemas.microsoft.com/office/drawing/2014/main" id="{978F8838-C51C-4E35-63FB-0F620BC754DB}"/>
+                </a:ext>
+              </a:extLst>
+            </wp:docPr>
+            <wp:cNvGraphicFramePr>
+              <a:graphicFrameLocks xmlns:a="http://schemas.openxmlformats.org/drawingml/2006/main" noChangeAspect="1"/>
+            </wp:cNvGraphicFramePr>
+            <a:graphic xmlns:a="http://schemas.openxmlformats.org/drawingml/2006/main">
+              <a:graphicData uri="http://schemas.openxmlformats.org/drawingml/2006/picture">
+                <pic:pic xmlns:pic="http://schemas.openxmlformats.org/drawingml/2006/picture">
+                  <pic:nvPicPr>
+                    <pic:cNvPr id="10" name="Picture 9" descr="A diagram of a company&#10;&#10;AI-generated content may be incorrect.">
+                      <a:extLst>
+                        <a:ext uri="{FF2B5EF4-FFF2-40B4-BE49-F238E27FC236}">
+                          <a16:creationId xmlns:a16="http://schemas.microsoft.com/office/drawing/2014/main" id="{978F8838-C51C-4E35-63FB-0F620BC754DB}"/>
+                        </a:ext>
+                      </a:extLst>
+                    </pic:cNvPr>
+                    <pic:cNvPicPr>
+                      <a:picLocks noChangeAspect="1"/>
+                    </pic:cNvPicPr>
+                  </pic:nvPicPr>
+                  <pic:blipFill>
+                    <a:blip r:embed="rId9"/>
+                    <a:stretch>
+                      <a:fillRect/>
+                    </a:stretch>
+                  </pic:blipFill>
+                  <pic:spPr>
+                    <a:xfrm>
+                      <a:off x="0" y="0"/>
+                      <a:ext cx="5731510" cy="2156460"/>
+                    </a:xfrm>
+                    <a:prstGeom prst="rect">
+                      <a:avLst/>
+                    </a:prstGeom>
+                  </pic:spPr>
+                </pic:pic>
+              </a:graphicData>
+            </a:graphic>
+          </wp:inline>
+        </w:drawing>
+      </w:r>
+    </w:p>
+    <w:p>
+      <w:pPr>
+        <w:pStyle w:val="NormalWeb"/>
+        <w:jc w:val="center"/>
+        <w:rPr>
+          <w:rFonts w:asciiTheme="minorHAnsi" w:eastAsiaTheme="minorEastAsia" w:hAnsiTheme="minorHAnsi" w:cstheme="minorBidi"/>
+          <w:sz w:val="18"/>
+          <w:szCs w:val="18"/>
+          <w:lang w:eastAsia="en-US"/>
+        </w:rPr>
+      </w:pPr>
+      <w:r>
+        <w:rPr>
+          <w:rFonts w:asciiTheme="minorHAnsi" w:eastAsiaTheme="minorEastAsia" w:hAnsiTheme="minorHAnsi" w:cstheme="minorBidi"/>
+          <w:sz w:val="18"/>
+          <w:szCs w:val="18"/>
+          <w:lang w:eastAsia="en-US"/>
+        </w:rPr>
+        <w:t>Link to paper : https://arxiv.org/pdf/2410.06011</w:t>
+      </w:r>
+    </w:p>
+    <w:p>
+      <w:pPr>
+        <w:pStyle w:val="NormalWeb"/>
+        <w:rPr>
+          <w:rFonts w:asciiTheme="minorHAnsi" w:eastAsiaTheme="minorEastAsia" w:hAnsiTheme="minorHAnsi" w:cstheme="minorBidi"/>
+          <w:lang w:eastAsia="en-US"/>
+        </w:rPr>
+      </w:pPr>
+    </w:p>
+    <w:p>
+      <w:pPr>
         <w:pStyle w:val="Heading2"/>
       </w:pPr>
-      <w:bookmarkStart w:id="13" w:name="_Toc220113125"/>
+      <w:bookmarkStart w:id="13" w:name="_Toc220173083"/>
       <w:r>
         <w:rPr>
           <w:rStyle w:val="Strong"/>
@@ -4028,6 +4131,7 @@
           <w:rFonts w:asciiTheme="minorHAnsi" w:eastAsiaTheme="minorEastAsia" w:hAnsiTheme="minorHAnsi" w:cstheme="minorBidi"/>
           <w:lang w:eastAsia="en-US"/>
         </w:rPr>
+        <w:lastRenderedPageBreak/>
         <w:t>In sequence-based models, the question and schema are tokenized and encoded using recurrent neural networks. The decoder generates SQL queries token by token, relying solely on learned sequence patterns. Transformer-based models improve upon this by applying self-attention mechanisms that allow the model to align relevant schema elements with parts of the user query.</w:t>
       </w:r>
     </w:p>
@@ -4164,7 +4268,6 @@
           <w:rFonts w:asciiTheme="minorHAnsi" w:eastAsiaTheme="minorEastAsia" w:hAnsiTheme="minorHAnsi" w:cstheme="minorBidi"/>
           <w:lang w:eastAsia="en-US"/>
         </w:rPr>
-        <w:lastRenderedPageBreak/>
         <w:t>Autoregressive SQL generation</w:t>
       </w:r>
     </w:p>
@@ -4236,7 +4339,7 @@
                     <pic:cNvPicPr/>
                   </pic:nvPicPr>
                   <pic:blipFill>
-                    <a:blip r:embed="rId9" cstate="print">
+                    <a:blip r:embed="rId10" cstate="print">
                       <a:extLst>
                         <a:ext uri="{28A0092B-C50C-407E-A947-70E740481C1C}">
                           <a14:useLocalDpi xmlns:a14="http://schemas.microsoft.com/office/drawing/2010/main" val="0"/>
@@ -4268,7 +4371,7 @@
       <w:pPr>
         <w:pStyle w:val="Heading2"/>
       </w:pPr>
-      <w:bookmarkStart w:id="14" w:name="_Toc220113126"/>
+      <w:bookmarkStart w:id="14" w:name="_Toc220173084"/>
       <w:r>
         <w:rPr>
           <w:rStyle w:val="Strong"/>
@@ -4326,6 +4429,7 @@
           <w:sz w:val="24"/>
           <w:szCs w:val="24"/>
         </w:rPr>
+        <w:lastRenderedPageBreak/>
         <w:t>While this approach ensures syntactic correctness for simple queries, it lacks flexibility and scalability. Complex queries involving nested subqueries, multiple joins, or conditional aggregations require handcrafted rules, which are difficult to maintain and extend. Furthermore, rule-based methods assume fixed schema knowledge and fail to generalize across different database structures.</w:t>
       </w:r>
     </w:p>
@@ -4460,7 +4564,6 @@
           <w:sz w:val="24"/>
           <w:szCs w:val="24"/>
         </w:rPr>
-        <w:lastRenderedPageBreak/>
         <w:t>Optional execution for validation</w:t>
       </w:r>
     </w:p>
@@ -4486,7 +4589,7 @@
                     <pic:cNvPicPr/>
                   </pic:nvPicPr>
                   <pic:blipFill>
-                    <a:blip r:embed="rId10" cstate="print">
+                    <a:blip r:embed="rId11" cstate="print">
                       <a:extLst>
                         <a:ext uri="{28A0092B-C50C-407E-A947-70E740481C1C}">
                           <a14:useLocalDpi xmlns:a14="http://schemas.microsoft.com/office/drawing/2010/main" val="0"/>
@@ -4519,7 +4622,7 @@
       <w:pPr>
         <w:pStyle w:val="Heading2"/>
       </w:pPr>
-      <w:bookmarkStart w:id="15" w:name="_Toc220113127"/>
+      <w:bookmarkStart w:id="15" w:name="_Toc220173085"/>
       <w:r>
         <w:rPr>
           <w:rStyle w:val="Strong"/>
@@ -4559,8 +4662,123 @@
           <w:rFonts w:asciiTheme="minorHAnsi" w:eastAsiaTheme="minorEastAsia" w:hAnsiTheme="minorHAnsi" w:cstheme="minorBidi"/>
           <w:lang w:eastAsia="en-US"/>
         </w:rPr>
+        <w:lastRenderedPageBreak/>
         <w:t>The pipeline begins with the extraction of relational schema metadata, including table names, column names, data types, and primary–foreign key relationships. This schema information is stored in a retrievable format and dynamically injected into the LLM prompt at inference time. By providing schema context, the model is guided toward generating MongoDB pipelines that reflect the actual database structure.</w:t>
       </w:r>
+    </w:p>
+    <w:p>
+      <w:pPr>
+        <w:pStyle w:val="NormalWeb"/>
+        <w:rPr>
+          <w:rFonts w:asciiTheme="minorHAnsi" w:eastAsiaTheme="minorEastAsia" w:hAnsiTheme="minorHAnsi" w:cstheme="minorBidi"/>
+          <w:lang w:eastAsia="en-US"/>
+        </w:rPr>
+      </w:pPr>
+      <w:r>
+        <w:rPr>
+          <w:rFonts w:asciiTheme="minorHAnsi" w:eastAsiaTheme="minorEastAsia" w:hAnsiTheme="minorHAnsi" w:cstheme="minorBidi"/>
+          <w:lang w:eastAsia="en-US"/>
+        </w:rPr>
+        <w:drawing>
+          <wp:inline distT="0" distB="0" distL="0" distR="0" wp14:anchorId="3C6F8AB5" wp14:editId="760B8BE5">
+            <wp:extent cx="5731510" cy="2039620"/>
+            <wp:effectExtent l="0" t="0" r="0" b="5080"/>
+            <wp:docPr id="4" name="Picture 3" descr="A screenshot of a computer&#10;&#10;AI-generated content may be incorrect.">
+              <a:extLst xmlns:a="http://schemas.openxmlformats.org/drawingml/2006/main">
+                <a:ext uri="{FF2B5EF4-FFF2-40B4-BE49-F238E27FC236}">
+                  <a16:creationId xmlns:a16="http://schemas.microsoft.com/office/drawing/2014/main" id="{C3E36AF7-5248-0C12-0B1D-FE8CA6386BB9}"/>
+                </a:ext>
+              </a:extLst>
+            </wp:docPr>
+            <wp:cNvGraphicFramePr>
+              <a:graphicFrameLocks xmlns:a="http://schemas.openxmlformats.org/drawingml/2006/main" noChangeAspect="1"/>
+            </wp:cNvGraphicFramePr>
+            <a:graphic xmlns:a="http://schemas.openxmlformats.org/drawingml/2006/main">
+              <a:graphicData uri="http://schemas.openxmlformats.org/drawingml/2006/picture">
+                <pic:pic xmlns:pic="http://schemas.openxmlformats.org/drawingml/2006/picture">
+                  <pic:nvPicPr>
+                    <pic:cNvPr id="4" name="Picture 3" descr="A screenshot of a computer&#10;&#10;AI-generated content may be incorrect.">
+                      <a:extLst>
+                        <a:ext uri="{FF2B5EF4-FFF2-40B4-BE49-F238E27FC236}">
+                          <a16:creationId xmlns:a16="http://schemas.microsoft.com/office/drawing/2014/main" id="{C3E36AF7-5248-0C12-0B1D-FE8CA6386BB9}"/>
+                        </a:ext>
+                      </a:extLst>
+                    </pic:cNvPr>
+                    <pic:cNvPicPr>
+                      <a:picLocks noChangeAspect="1"/>
+                    </pic:cNvPicPr>
+                  </pic:nvPicPr>
+                  <pic:blipFill>
+                    <a:blip r:embed="rId12"/>
+                    <a:stretch>
+                      <a:fillRect/>
+                    </a:stretch>
+                  </pic:blipFill>
+                  <pic:spPr>
+                    <a:xfrm>
+                      <a:off x="0" y="0"/>
+                      <a:ext cx="5731510" cy="2039620"/>
+                    </a:xfrm>
+                    <a:prstGeom prst="rect">
+                      <a:avLst/>
+                    </a:prstGeom>
+                  </pic:spPr>
+                </pic:pic>
+              </a:graphicData>
+            </a:graphic>
+          </wp:inline>
+        </w:drawing>
+      </w:r>
+    </w:p>
+    <w:p>
+      <w:pPr>
+        <w:pStyle w:val="NormalWeb"/>
+        <w:jc w:val="center"/>
+        <w:rPr>
+          <w:rFonts w:asciiTheme="minorHAnsi" w:eastAsiaTheme="minorEastAsia" w:hAnsiTheme="minorHAnsi" w:cstheme="minorBidi"/>
+          <w:sz w:val="20"/>
+          <w:szCs w:val="20"/>
+          <w:lang w:eastAsia="en-US"/>
+        </w:rPr>
+      </w:pPr>
+      <w:r>
+        <w:rPr>
+          <w:rFonts w:asciiTheme="minorHAnsi" w:eastAsiaTheme="minorEastAsia" w:hAnsiTheme="minorHAnsi" w:cstheme="minorBidi"/>
+          <w:sz w:val="20"/>
+          <w:szCs w:val="20"/>
+          <w:lang w:eastAsia="en-US"/>
+        </w:rPr>
+        <w:t xml:space="preserve">Link to </w:t>
+      </w:r>
+      <w:proofErr w:type="gramStart"/>
+      <w:r>
+        <w:rPr>
+          <w:rFonts w:asciiTheme="minorHAnsi" w:eastAsiaTheme="minorEastAsia" w:hAnsiTheme="minorHAnsi" w:cstheme="minorBidi"/>
+          <w:sz w:val="20"/>
+          <w:szCs w:val="20"/>
+          <w:lang w:eastAsia="en-US"/>
+        </w:rPr>
+        <w:t>paper :</w:t>
+      </w:r>
+      <w:proofErr w:type="gramEnd"/>
+      <w:r>
+        <w:rPr>
+          <w:rFonts w:asciiTheme="minorHAnsi" w:eastAsiaTheme="minorEastAsia" w:hAnsiTheme="minorHAnsi" w:cstheme="minorBidi"/>
+          <w:sz w:val="20"/>
+          <w:szCs w:val="20"/>
+          <w:lang w:eastAsia="en-US"/>
+        </w:rPr>
+        <w:t xml:space="preserve"> https://arxiv.org/pdf/2502.11201</w:t>
+      </w:r>
+    </w:p>
+    <w:p>
+      <w:pPr>
+        <w:pStyle w:val="NormalWeb"/>
+        <w:rPr>
+          <w:rFonts w:asciiTheme="minorHAnsi" w:eastAsiaTheme="minorEastAsia" w:hAnsiTheme="minorHAnsi" w:cstheme="minorBidi"/>
+          <w:lang w:eastAsia="en-US"/>
+        </w:rPr>
+      </w:pPr>
     </w:p>
     <w:p>
       <w:pPr>
@@ -4629,7 +4847,6 @@
           <w:rFonts w:asciiTheme="minorHAnsi" w:eastAsiaTheme="minorEastAsia" w:hAnsiTheme="minorHAnsi" w:cstheme="minorBidi"/>
           <w:lang w:eastAsia="en-US"/>
         </w:rPr>
-        <w:lastRenderedPageBreak/>
         <w:t>SQL query input</w:t>
       </w:r>
     </w:p>
@@ -4768,6 +4985,7 @@
           <w:noProof/>
           <w14:ligatures w14:val="standardContextual"/>
         </w:rPr>
+        <w:lastRenderedPageBreak/>
         <w:drawing>
           <wp:inline distT="0" distB="0" distL="0" distR="0" wp14:anchorId="01CC5154" wp14:editId="0C7819AF">
             <wp:extent cx="5731510" cy="1297305"/>
@@ -4784,7 +5002,7 @@
                     <pic:cNvPicPr/>
                   </pic:nvPicPr>
                   <pic:blipFill>
-                    <a:blip r:embed="rId11" cstate="print">
+                    <a:blip r:embed="rId13" cstate="print">
                       <a:extLst>
                         <a:ext uri="{28A0092B-C50C-407E-A947-70E740481C1C}">
                           <a14:useLocalDpi xmlns:a14="http://schemas.microsoft.com/office/drawing/2010/main" val="0"/>
@@ -4824,6 +5042,28 @@
     </w:p>
     <w:p>
       <w:pPr>
+        <w:pStyle w:val="NormalWeb"/>
+        <w:rPr>
+          <w:rFonts w:asciiTheme="minorHAnsi" w:eastAsiaTheme="minorEastAsia" w:hAnsiTheme="minorHAnsi" w:cstheme="minorBidi"/>
+          <w:sz w:val="28"/>
+          <w:szCs w:val="28"/>
+          <w:lang w:eastAsia="en-US"/>
+        </w:rPr>
+      </w:pPr>
+    </w:p>
+    <w:p>
+      <w:pPr>
+        <w:pStyle w:val="NormalWeb"/>
+        <w:rPr>
+          <w:rFonts w:asciiTheme="minorHAnsi" w:eastAsiaTheme="minorEastAsia" w:hAnsiTheme="minorHAnsi" w:cstheme="minorBidi"/>
+          <w:sz w:val="28"/>
+          <w:szCs w:val="28"/>
+          <w:lang w:eastAsia="en-US"/>
+        </w:rPr>
+      </w:pPr>
+    </w:p>
+    <w:p>
+      <w:pPr>
         <w:pStyle w:val="Heading2"/>
         <w:rPr>
           <w:rStyle w:val="Strong"/>
@@ -4831,7 +5071,7 @@
           <w:bCs w:val="0"/>
         </w:rPr>
       </w:pPr>
-      <w:bookmarkStart w:id="16" w:name="_Toc220113128"/>
+      <w:bookmarkStart w:id="16" w:name="_Toc220173086"/>
       <w:r>
         <w:rPr>
           <w:rStyle w:val="Strong"/>
@@ -5851,12 +6091,11 @@
           <w:rFonts w:eastAsiaTheme="minorEastAsia"/>
         </w:rPr>
       </w:pPr>
-      <w:bookmarkStart w:id="17" w:name="_Toc220113129"/>
+      <w:bookmarkStart w:id="17" w:name="_Toc220173087"/>
       <w:r>
         <w:rPr>
           <w:rFonts w:eastAsiaTheme="minorEastAsia"/>
         </w:rPr>
-        <w:lastRenderedPageBreak/>
         <w:t>Datasets Used</w:t>
       </w:r>
       <w:bookmarkEnd w:id="17"/>
@@ -5876,7 +6115,15 @@
           <w:rFonts w:asciiTheme="minorHAnsi" w:eastAsiaTheme="minorEastAsia" w:hAnsiTheme="minorHAnsi" w:cstheme="minorBidi"/>
           <w:lang w:eastAsia="en-US"/>
         </w:rPr>
-        <w:t>The evaluation of structured query generation models requires datasets that capture varying levels of query complexity, schema diversity, and execution semantics. To ensure comprehensive analysis, this project uses multiple datasets that together represent both simplified academic benchmarks and realistic production-oriented workloads</w:t>
+        <w:t xml:space="preserve">The evaluation of structured query generation models requires datasets that capture varying levels of query complexity, schema diversity, and execution semantics. To ensure comprehensive analysis, this project uses multiple datasets that together </w:t>
+      </w:r>
+      <w:r>
+        <w:rPr>
+          <w:rFonts w:asciiTheme="minorHAnsi" w:eastAsiaTheme="minorEastAsia" w:hAnsiTheme="minorHAnsi" w:cstheme="minorBidi"/>
+          <w:lang w:eastAsia="en-US"/>
+        </w:rPr>
+        <w:lastRenderedPageBreak/>
+        <w:t>represent both simplified academic benchmarks and realistic production-oriented workloads</w:t>
       </w:r>
       <w:r>
         <w:rPr>
@@ -5892,7 +6139,7 @@
       <w:pPr>
         <w:pStyle w:val="Heading2"/>
       </w:pPr>
-      <w:bookmarkStart w:id="18" w:name="_Toc220113130"/>
+      <w:bookmarkStart w:id="18" w:name="_Toc220173088"/>
       <w:r>
         <w:rPr>
           <w:rStyle w:val="Strong"/>
@@ -5955,7 +6202,7 @@
       <w:pPr>
         <w:pStyle w:val="Heading2"/>
       </w:pPr>
-      <w:bookmarkStart w:id="19" w:name="_Toc220113131"/>
+      <w:bookmarkStart w:id="19" w:name="_Toc220173089"/>
       <w:r>
         <w:rPr>
           <w:rStyle w:val="Strong"/>
@@ -6034,32 +6281,39 @@
       <w:pPr>
         <w:pStyle w:val="Heading2"/>
       </w:pPr>
-      <w:bookmarkStart w:id="20" w:name="_Toc220113132"/>
+      <w:bookmarkStart w:id="20" w:name="_Toc220173090"/>
       <w:r>
         <w:rPr>
           <w:rStyle w:val="Strong"/>
           <w:b w:val="0"/>
           <w:bCs w:val="0"/>
         </w:rPr>
+        <w:t>7.3 BirdBench Dataset</w:t>
+      </w:r>
+      <w:bookmarkEnd w:id="20"/>
+    </w:p>
+    <w:p>
+      <w:pPr>
+        <w:pStyle w:val="NormalWeb"/>
+        <w:rPr>
+          <w:rFonts w:asciiTheme="minorHAnsi" w:eastAsiaTheme="minorEastAsia" w:hAnsiTheme="minorHAnsi" w:cstheme="minorBidi"/>
+          <w:lang w:eastAsia="en-US"/>
+        </w:rPr>
+      </w:pPr>
+      <w:r>
+        <w:rPr>
+          <w:rFonts w:asciiTheme="minorHAnsi" w:eastAsiaTheme="minorEastAsia" w:hAnsiTheme="minorHAnsi" w:cstheme="minorBidi"/>
+          <w:lang w:eastAsia="en-US"/>
+        </w:rPr>
+        <w:t xml:space="preserve">BirdBench is an execution-centric benchmark designed to evaluate semantic correctness rather than syntactic similarity. Unlike traditional Text-to-SQL datasets, BirdBench focuses on validating query outputs by executing them on real database engines and comparing results. It supports multiple database systems, including </w:t>
+      </w:r>
+      <w:r>
+        <w:rPr>
+          <w:rFonts w:asciiTheme="minorHAnsi" w:eastAsiaTheme="minorEastAsia" w:hAnsiTheme="minorHAnsi" w:cstheme="minorBidi"/>
+          <w:lang w:eastAsia="en-US"/>
+        </w:rPr>
         <w:lastRenderedPageBreak/>
-        <w:t>7.3 BirdBench Dataset</w:t>
-      </w:r>
-      <w:bookmarkEnd w:id="20"/>
-    </w:p>
-    <w:p>
-      <w:pPr>
-        <w:pStyle w:val="NormalWeb"/>
-        <w:rPr>
-          <w:rFonts w:asciiTheme="minorHAnsi" w:eastAsiaTheme="minorEastAsia" w:hAnsiTheme="minorHAnsi" w:cstheme="minorBidi"/>
-          <w:lang w:eastAsia="en-US"/>
-        </w:rPr>
-      </w:pPr>
-      <w:r>
-        <w:rPr>
-          <w:rFonts w:asciiTheme="minorHAnsi" w:eastAsiaTheme="minorEastAsia" w:hAnsiTheme="minorHAnsi" w:cstheme="minorBidi"/>
-          <w:lang w:eastAsia="en-US"/>
-        </w:rPr>
-        <w:t>BirdBench is an execution-centric benchmark designed to evaluate semantic correctness rather than syntactic similarity. Unlike traditional Text-to-SQL datasets, BirdBench focuses on validating query outputs by executing them on real database engines and comparing results. It supports multiple database systems, including SQLite, PostgreSQL, and MySQL, and includes queries that reflect real-world analytical workloads.</w:t>
+        <w:t>SQLite, PostgreSQL, and MySQL, and includes queries that reflect real-world analytical workloads.</w:t>
       </w:r>
     </w:p>
     <w:p>
@@ -6125,7 +6379,7 @@
       <w:pPr>
         <w:pStyle w:val="Heading2"/>
       </w:pPr>
-      <w:bookmarkStart w:id="21" w:name="_Toc220113133"/>
+      <w:bookmarkStart w:id="21" w:name="_Toc220173091"/>
       <w:r>
         <w:rPr>
           <w:rStyle w:val="Strong"/>
@@ -6163,7 +6417,7 @@
           <w:rFonts w:eastAsiaTheme="minorEastAsia"/>
         </w:rPr>
       </w:pPr>
-      <w:bookmarkStart w:id="22" w:name="_Toc220113134"/>
+      <w:bookmarkStart w:id="22" w:name="_Toc220173092"/>
       <w:r>
         <w:rPr>
           <w:rFonts w:eastAsiaTheme="minorEastAsia"/>
@@ -6181,7 +6435,7 @@
           <w:szCs w:val="36"/>
         </w:rPr>
       </w:pPr>
-      <w:bookmarkStart w:id="23" w:name="_Toc220113135"/>
+      <w:bookmarkStart w:id="23" w:name="_Toc220173093"/>
       <w:r>
         <w:rPr>
           <w:rStyle w:val="Strong"/>
@@ -6249,15 +6503,7 @@
           <w:lang w:eastAsia="en-US"/>
         </w:rPr>
         <w:br/>
-        <w:t xml:space="preserve">Execution accuracy evaluates whether the generated SQL query produces the same result as the reference query when executed on the database. This metric </w:t>
-      </w:r>
-      <w:r>
-        <w:rPr>
-          <w:rFonts w:asciiTheme="minorHAnsi" w:eastAsiaTheme="minorEastAsia" w:hAnsiTheme="minorHAnsi" w:cstheme="minorBidi"/>
-          <w:lang w:eastAsia="en-US"/>
-        </w:rPr>
-        <w:lastRenderedPageBreak/>
-        <w:t>directly captures semantic correctness and is more reliable than exact match accuracy, especially for complex queries.</w:t>
+        <w:t>Execution accuracy evaluates whether the generated SQL query produces the same result as the reference query when executed on the database. This metric directly captures semantic correctness and is more reliable than exact match accuracy, especially for complex queries.</w:t>
       </w:r>
     </w:p>
     <w:p>
@@ -6311,6 +6557,7 @@
           <w:bCs/>
           <w:lang w:eastAsia="en-US"/>
         </w:rPr>
+        <w:lastRenderedPageBreak/>
         <w:t>Valid Efficiency Score</w:t>
       </w:r>
       <w:r>
@@ -6333,7 +6580,7 @@
           <w:rStyle w:val="Strong"/>
         </w:rPr>
       </w:pPr>
-      <w:bookmarkStart w:id="24" w:name="_Toc220113136"/>
+      <w:bookmarkStart w:id="24" w:name="_Toc220173094"/>
       <w:r>
         <w:rPr>
           <w:rStyle w:val="Strong"/>
@@ -6448,7 +6695,7 @@
           <w:bCs w:val="0"/>
         </w:rPr>
       </w:pPr>
-      <w:bookmarkStart w:id="25" w:name="_Toc220113137"/>
+      <w:bookmarkStart w:id="25" w:name="_Toc220173095"/>
       <w:r>
         <w:rPr>
           <w:rStyle w:val="Strong"/>
@@ -6463,7 +6710,7 @@
       <w:pPr>
         <w:pStyle w:val="Heading3"/>
       </w:pPr>
-      <w:bookmarkStart w:id="26" w:name="_Toc220113138"/>
+      <w:bookmarkStart w:id="26" w:name="_Toc220173096"/>
       <w:r>
         <w:t>Text 2 SQL</w:t>
       </w:r>
@@ -7204,23 +7451,23 @@
           <w:rFonts w:asciiTheme="minorHAnsi" w:eastAsiaTheme="minorEastAsia" w:hAnsiTheme="minorHAnsi" w:cstheme="minorBidi"/>
           <w:lang w:eastAsia="en-US"/>
         </w:rPr>
+        <w:t>The LSTM-based SQLNet model performs poorly across all evaluation metrics. Its low execution accuracy highlights the inability of sequence-only models to capture complex schema relationships, particularly in multi-table queries. This confirms the limitations of early Text-to-SQL approaches when applied to realistic datasets.</w:t>
+      </w:r>
+    </w:p>
+    <w:p>
+      <w:pPr>
+        <w:pStyle w:val="NormalWeb"/>
+        <w:rPr>
+          <w:rFonts w:asciiTheme="minorHAnsi" w:eastAsiaTheme="minorEastAsia" w:hAnsiTheme="minorHAnsi" w:cstheme="minorBidi"/>
+          <w:lang w:eastAsia="en-US"/>
+        </w:rPr>
+      </w:pPr>
+      <w:r>
+        <w:rPr>
+          <w:rFonts w:asciiTheme="minorHAnsi" w:eastAsiaTheme="minorEastAsia" w:hAnsiTheme="minorHAnsi" w:cstheme="minorBidi"/>
+          <w:lang w:eastAsia="en-US"/>
+        </w:rPr>
         <w:lastRenderedPageBreak/>
-        <w:t>The LSTM-based SQLNet model performs poorly across all evaluation metrics. Its low execution accuracy highlights the inability of sequence-only models to capture complex schema relationships, particularly in multi-table queries. This confirms the limitations of early Text-to-SQL approaches when applied to realistic datasets.</w:t>
-      </w:r>
-    </w:p>
-    <w:p>
-      <w:pPr>
-        <w:pStyle w:val="NormalWeb"/>
-        <w:rPr>
-          <w:rFonts w:asciiTheme="minorHAnsi" w:eastAsiaTheme="minorEastAsia" w:hAnsiTheme="minorHAnsi" w:cstheme="minorBidi"/>
-          <w:lang w:eastAsia="en-US"/>
-        </w:rPr>
-      </w:pPr>
-      <w:r>
-        <w:rPr>
-          <w:rFonts w:asciiTheme="minorHAnsi" w:eastAsiaTheme="minorEastAsia" w:hAnsiTheme="minorHAnsi" w:cstheme="minorBidi"/>
-          <w:lang w:eastAsia="en-US"/>
-        </w:rPr>
         <w:t xml:space="preserve">Transformer-based models demonstrate substantial improvements. The fine-tuned T5 model shows a significant increase in execution accuracy, indicating that attention-based mechanisms enable better alignment between user questions and schema elements. The </w:t>
       </w:r>
       <w:proofErr w:type="spellStart"/>
@@ -7278,7 +7525,7 @@
       <w:pPr>
         <w:pStyle w:val="Heading3"/>
       </w:pPr>
-      <w:bookmarkStart w:id="27" w:name="_Toc220113139"/>
+      <w:bookmarkStart w:id="27" w:name="_Toc220173097"/>
       <w:r>
         <w:t>S</w:t>
       </w:r>
@@ -7540,7 +7787,7 @@
       <w:pPr>
         <w:pStyle w:val="Heading3"/>
       </w:pPr>
-      <w:bookmarkStart w:id="28" w:name="_Toc220113140"/>
+      <w:bookmarkStart w:id="28" w:name="_Toc220173098"/>
       <w:r>
         <w:t>SQL-to-NoSQL Evaluation Results (LLM-Based Models)</w:t>
       </w:r>
@@ -7598,7 +7845,6 @@
                 <w:sz w:val="24"/>
                 <w:szCs w:val="24"/>
               </w:rPr>
-              <w:lastRenderedPageBreak/>
               <w:t>Model</w:t>
             </w:r>
           </w:p>
@@ -8021,6 +8267,7 @@
                 <w:sz w:val="20"/>
                 <w:szCs w:val="20"/>
               </w:rPr>
+              <w:lastRenderedPageBreak/>
               <w:t>LLM + RAG (Schema + Join Templates)</w:t>
             </w:r>
           </w:p>
@@ -8185,6 +8432,107 @@
     </w:p>
     <w:p>
       <w:pPr>
+        <w:pStyle w:val="NormalWeb"/>
+        <w:rPr>
+          <w:rFonts w:asciiTheme="minorHAnsi" w:eastAsiaTheme="minorEastAsia" w:hAnsiTheme="minorHAnsi" w:cstheme="minorBidi"/>
+          <w:lang w:eastAsia="en-US"/>
+        </w:rPr>
+      </w:pPr>
+      <w:r>
+        <w:rPr>
+          <w:rFonts w:asciiTheme="minorHAnsi" w:eastAsiaTheme="minorEastAsia" w:hAnsiTheme="minorHAnsi" w:cstheme="minorBidi"/>
+          <w:lang w:eastAsia="en-US"/>
+        </w:rPr>
+        <w:t>Final Deployed Result:</w:t>
+      </w:r>
+    </w:p>
+    <w:p>
+      <w:pPr>
+        <w:pStyle w:val="NormalWeb"/>
+        <w:rPr>
+          <w:rFonts w:asciiTheme="minorHAnsi" w:eastAsiaTheme="minorEastAsia" w:hAnsiTheme="minorHAnsi" w:cstheme="minorBidi"/>
+          <w:lang w:eastAsia="en-US"/>
+        </w:rPr>
+      </w:pPr>
+      <w:r>
+        <w:rPr>
+          <w:rFonts w:asciiTheme="minorHAnsi" w:eastAsiaTheme="minorEastAsia" w:hAnsiTheme="minorHAnsi" w:cstheme="minorBidi"/>
+          <w:noProof/>
+          <w:lang w:eastAsia="en-US"/>
+          <w14:ligatures w14:val="standardContextual"/>
+        </w:rPr>
+        <w:drawing>
+          <wp:inline distT="0" distB="0" distL="0" distR="0" wp14:anchorId="29D45696" wp14:editId="50FC90D5">
+            <wp:extent cx="5731510" cy="2938780"/>
+            <wp:effectExtent l="0" t="0" r="0" b="0"/>
+            <wp:docPr id="112482130" name="Picture 1" descr="A screenshot of a computer&#10;&#10;AI-generated content may be incorrect."/>
+            <wp:cNvGraphicFramePr>
+              <a:graphicFrameLocks xmlns:a="http://schemas.openxmlformats.org/drawingml/2006/main" noChangeAspect="1"/>
+            </wp:cNvGraphicFramePr>
+            <a:graphic xmlns:a="http://schemas.openxmlformats.org/drawingml/2006/main">
+              <a:graphicData uri="http://schemas.openxmlformats.org/drawingml/2006/picture">
+                <pic:pic xmlns:pic="http://schemas.openxmlformats.org/drawingml/2006/picture">
+                  <pic:nvPicPr>
+                    <pic:cNvPr id="112482130" name="Picture 1" descr="A screenshot of a computer&#10;&#10;AI-generated content may be incorrect."/>
+                    <pic:cNvPicPr/>
+                  </pic:nvPicPr>
+                  <pic:blipFill>
+                    <a:blip r:embed="rId14" cstate="print">
+                      <a:extLst>
+                        <a:ext uri="{28A0092B-C50C-407E-A947-70E740481C1C}">
+                          <a14:useLocalDpi xmlns:a14="http://schemas.microsoft.com/office/drawing/2010/main" val="0"/>
+                        </a:ext>
+                      </a:extLst>
+                    </a:blip>
+                    <a:stretch>
+                      <a:fillRect/>
+                    </a:stretch>
+                  </pic:blipFill>
+                  <pic:spPr>
+                    <a:xfrm>
+                      <a:off x="0" y="0"/>
+                      <a:ext cx="5731510" cy="2938780"/>
+                    </a:xfrm>
+                    <a:prstGeom prst="rect">
+                      <a:avLst/>
+                    </a:prstGeom>
+                  </pic:spPr>
+                </pic:pic>
+              </a:graphicData>
+            </a:graphic>
+          </wp:inline>
+        </w:drawing>
+      </w:r>
+    </w:p>
+    <w:p>
+      <w:pPr>
+        <w:pStyle w:val="NormalWeb"/>
+        <w:rPr>
+          <w:rFonts w:asciiTheme="minorHAnsi" w:eastAsiaTheme="minorEastAsia" w:hAnsiTheme="minorHAnsi" w:cstheme="minorBidi"/>
+          <w:lang w:eastAsia="en-US"/>
+        </w:rPr>
+      </w:pPr>
+    </w:p>
+    <w:p>
+      <w:pPr>
+        <w:pStyle w:val="NormalWeb"/>
+        <w:rPr>
+          <w:rFonts w:asciiTheme="minorHAnsi" w:eastAsiaTheme="minorEastAsia" w:hAnsiTheme="minorHAnsi" w:cstheme="minorBidi"/>
+          <w:lang w:eastAsia="en-US"/>
+        </w:rPr>
+      </w:pPr>
+    </w:p>
+    <w:p>
+      <w:pPr>
+        <w:pStyle w:val="NormalWeb"/>
+        <w:rPr>
+          <w:rFonts w:asciiTheme="minorHAnsi" w:eastAsiaTheme="minorEastAsia" w:hAnsiTheme="minorHAnsi" w:cstheme="minorBidi"/>
+          <w:lang w:eastAsia="en-US"/>
+        </w:rPr>
+      </w:pPr>
+    </w:p>
+    <w:p>
+      <w:pPr>
         <w:pStyle w:val="Heading1"/>
         <w:numPr>
           <w:ilvl w:val="0"/>
@@ -8194,11 +8542,12 @@
           <w:rFonts w:eastAsiaTheme="minorEastAsia"/>
         </w:rPr>
       </w:pPr>
-      <w:bookmarkStart w:id="29" w:name="_Toc220113141"/>
+      <w:bookmarkStart w:id="29" w:name="_Toc220173099"/>
       <w:r>
         <w:rPr>
           <w:rFonts w:eastAsiaTheme="minorEastAsia"/>
         </w:rPr>
+        <w:lastRenderedPageBreak/>
         <w:t>Limitations</w:t>
       </w:r>
       <w:bookmarkEnd w:id="29"/>
@@ -8314,15 +8663,7 @@
           <w:rFonts w:asciiTheme="minorHAnsi" w:eastAsiaTheme="minorEastAsia" w:hAnsiTheme="minorHAnsi" w:cstheme="minorBidi"/>
           <w:lang w:eastAsia="en-US"/>
         </w:rPr>
-        <w:t xml:space="preserve">The SQL-to-NoSQL translation component focuses exclusively on MongoDB as the target NoSQL system. While MongoDB is widely used, other NoSQL databases such as Cassandra, DynamoDB, and Neo4j follow fundamentally different data models and query paradigms. The current </w:t>
-      </w:r>
-      <w:r>
-        <w:rPr>
-          <w:rFonts w:asciiTheme="minorHAnsi" w:eastAsiaTheme="minorEastAsia" w:hAnsiTheme="minorHAnsi" w:cstheme="minorBidi"/>
-          <w:lang w:eastAsia="en-US"/>
-        </w:rPr>
-        <w:lastRenderedPageBreak/>
-        <w:t>approach does not generalize directly to these systems without additional schema representation and translation logic.</w:t>
+        <w:t>The SQL-to-NoSQL translation component focuses exclusively on MongoDB as the target NoSQL system. While MongoDB is widely used, other NoSQL databases such as Cassandra, DynamoDB, and Neo4j follow fundamentally different data models and query paradigms. The current approach does not generalize directly to these systems without additional schema representation and translation logic.</w:t>
       </w:r>
     </w:p>
     <w:p>
@@ -8461,7 +8802,15 @@
           <w:rFonts w:asciiTheme="minorHAnsi" w:eastAsiaTheme="minorEastAsia" w:hAnsiTheme="minorHAnsi" w:cstheme="minorBidi"/>
           <w:lang w:eastAsia="en-US"/>
         </w:rPr>
-        <w:t>The models are evaluated primarily on academic benchmarks and controlled datasets. Real-world databases often include noisy schemas, incomplete documentation, and evolving data distributions. The robustness of the proposed methods under such conditions has not been fully validated.</w:t>
+        <w:t xml:space="preserve">The models are evaluated primarily on academic benchmarks and controlled datasets. Real-world databases often include noisy schemas, incomplete documentation, and evolving data </w:t>
+      </w:r>
+      <w:r>
+        <w:rPr>
+          <w:rFonts w:asciiTheme="minorHAnsi" w:eastAsiaTheme="minorEastAsia" w:hAnsiTheme="minorHAnsi" w:cstheme="minorBidi"/>
+          <w:lang w:eastAsia="en-US"/>
+        </w:rPr>
+        <w:lastRenderedPageBreak/>
+        <w:t>distributions. The robustness of the proposed methods under such conditions has not been fully validated.</w:t>
       </w:r>
     </w:p>
     <w:p>
@@ -8515,6 +8864,158 @@
     </w:p>
     <w:p>
       <w:pPr>
+        <w:pStyle w:val="ListParagraph"/>
+        <w:rPr>
+          <w:rFonts w:eastAsiaTheme="minorEastAsia"/>
+        </w:rPr>
+      </w:pPr>
+    </w:p>
+    <w:p>
+      <w:pPr>
+        <w:pStyle w:val="NormalWeb"/>
+        <w:rPr>
+          <w:rFonts w:asciiTheme="minorHAnsi" w:eastAsiaTheme="minorEastAsia" w:hAnsiTheme="minorHAnsi" w:cstheme="minorBidi"/>
+          <w:lang w:eastAsia="en-US"/>
+        </w:rPr>
+      </w:pPr>
+    </w:p>
+    <w:p>
+      <w:pPr>
+        <w:pStyle w:val="NormalWeb"/>
+        <w:rPr>
+          <w:rFonts w:asciiTheme="minorHAnsi" w:eastAsiaTheme="minorEastAsia" w:hAnsiTheme="minorHAnsi" w:cstheme="minorBidi"/>
+          <w:lang w:eastAsia="en-US"/>
+        </w:rPr>
+      </w:pPr>
+    </w:p>
+    <w:p>
+      <w:pPr>
+        <w:pStyle w:val="NormalWeb"/>
+        <w:rPr>
+          <w:rFonts w:asciiTheme="minorHAnsi" w:eastAsiaTheme="minorEastAsia" w:hAnsiTheme="minorHAnsi" w:cstheme="minorBidi"/>
+          <w:lang w:eastAsia="en-US"/>
+        </w:rPr>
+      </w:pPr>
+    </w:p>
+    <w:p>
+      <w:pPr>
+        <w:pStyle w:val="NormalWeb"/>
+        <w:rPr>
+          <w:rFonts w:asciiTheme="minorHAnsi" w:eastAsiaTheme="minorEastAsia" w:hAnsiTheme="minorHAnsi" w:cstheme="minorBidi"/>
+          <w:lang w:eastAsia="en-US"/>
+        </w:rPr>
+      </w:pPr>
+    </w:p>
+    <w:p>
+      <w:pPr>
+        <w:pStyle w:val="NormalWeb"/>
+        <w:rPr>
+          <w:rFonts w:asciiTheme="minorHAnsi" w:eastAsiaTheme="minorEastAsia" w:hAnsiTheme="minorHAnsi" w:cstheme="minorBidi"/>
+          <w:lang w:eastAsia="en-US"/>
+        </w:rPr>
+      </w:pPr>
+    </w:p>
+    <w:p>
+      <w:pPr>
+        <w:pStyle w:val="NormalWeb"/>
+        <w:rPr>
+          <w:rFonts w:asciiTheme="minorHAnsi" w:eastAsiaTheme="minorEastAsia" w:hAnsiTheme="minorHAnsi" w:cstheme="minorBidi"/>
+          <w:lang w:eastAsia="en-US"/>
+        </w:rPr>
+      </w:pPr>
+    </w:p>
+    <w:p>
+      <w:pPr>
+        <w:pStyle w:val="NormalWeb"/>
+        <w:rPr>
+          <w:rFonts w:asciiTheme="minorHAnsi" w:eastAsiaTheme="minorEastAsia" w:hAnsiTheme="minorHAnsi" w:cstheme="minorBidi"/>
+          <w:lang w:eastAsia="en-US"/>
+        </w:rPr>
+      </w:pPr>
+    </w:p>
+    <w:p>
+      <w:pPr>
+        <w:pStyle w:val="NormalWeb"/>
+        <w:rPr>
+          <w:rFonts w:asciiTheme="minorHAnsi" w:eastAsiaTheme="minorEastAsia" w:hAnsiTheme="minorHAnsi" w:cstheme="minorBidi"/>
+          <w:lang w:eastAsia="en-US"/>
+        </w:rPr>
+      </w:pPr>
+    </w:p>
+    <w:p>
+      <w:pPr>
+        <w:pStyle w:val="NormalWeb"/>
+        <w:rPr>
+          <w:rFonts w:asciiTheme="minorHAnsi" w:eastAsiaTheme="minorEastAsia" w:hAnsiTheme="minorHAnsi" w:cstheme="minorBidi"/>
+          <w:lang w:eastAsia="en-US"/>
+        </w:rPr>
+      </w:pPr>
+    </w:p>
+    <w:p>
+      <w:pPr>
+        <w:pStyle w:val="NormalWeb"/>
+        <w:rPr>
+          <w:rFonts w:asciiTheme="minorHAnsi" w:eastAsiaTheme="minorEastAsia" w:hAnsiTheme="minorHAnsi" w:cstheme="minorBidi"/>
+          <w:lang w:eastAsia="en-US"/>
+        </w:rPr>
+      </w:pPr>
+    </w:p>
+    <w:p>
+      <w:pPr>
+        <w:pStyle w:val="NormalWeb"/>
+        <w:rPr>
+          <w:rFonts w:asciiTheme="minorHAnsi" w:eastAsiaTheme="minorEastAsia" w:hAnsiTheme="minorHAnsi" w:cstheme="minorBidi"/>
+          <w:lang w:eastAsia="en-US"/>
+        </w:rPr>
+      </w:pPr>
+    </w:p>
+    <w:p>
+      <w:pPr>
+        <w:pStyle w:val="NormalWeb"/>
+        <w:rPr>
+          <w:rFonts w:asciiTheme="minorHAnsi" w:eastAsiaTheme="minorEastAsia" w:hAnsiTheme="minorHAnsi" w:cstheme="minorBidi"/>
+          <w:lang w:eastAsia="en-US"/>
+        </w:rPr>
+      </w:pPr>
+    </w:p>
+    <w:p>
+      <w:pPr>
+        <w:pStyle w:val="NormalWeb"/>
+        <w:rPr>
+          <w:rFonts w:asciiTheme="minorHAnsi" w:eastAsiaTheme="minorEastAsia" w:hAnsiTheme="minorHAnsi" w:cstheme="minorBidi"/>
+          <w:lang w:eastAsia="en-US"/>
+        </w:rPr>
+      </w:pPr>
+    </w:p>
+    <w:p>
+      <w:pPr>
+        <w:pStyle w:val="NormalWeb"/>
+        <w:rPr>
+          <w:rFonts w:asciiTheme="minorHAnsi" w:eastAsiaTheme="minorEastAsia" w:hAnsiTheme="minorHAnsi" w:cstheme="minorBidi"/>
+          <w:lang w:eastAsia="en-US"/>
+        </w:rPr>
+      </w:pPr>
+    </w:p>
+    <w:p>
+      <w:pPr>
+        <w:pStyle w:val="NormalWeb"/>
+        <w:rPr>
+          <w:rFonts w:asciiTheme="minorHAnsi" w:eastAsiaTheme="minorEastAsia" w:hAnsiTheme="minorHAnsi" w:cstheme="minorBidi"/>
+          <w:lang w:eastAsia="en-US"/>
+        </w:rPr>
+      </w:pPr>
+    </w:p>
+    <w:p>
+      <w:pPr>
+        <w:pStyle w:val="NormalWeb"/>
+        <w:rPr>
+          <w:rFonts w:asciiTheme="minorHAnsi" w:eastAsiaTheme="minorEastAsia" w:hAnsiTheme="minorHAnsi" w:cstheme="minorBidi"/>
+          <w:lang w:eastAsia="en-US"/>
+        </w:rPr>
+      </w:pPr>
+    </w:p>
+    <w:p>
+      <w:pPr>
         <w:pStyle w:val="Heading1"/>
         <w:numPr>
           <w:ilvl w:val="0"/>
@@ -8524,11 +9025,12 @@
           <w:rFonts w:eastAsiaTheme="minorEastAsia"/>
         </w:rPr>
       </w:pPr>
-      <w:bookmarkStart w:id="30" w:name="_Toc220113142"/>
+      <w:bookmarkStart w:id="30" w:name="_Toc220173100"/>
       <w:r>
         <w:rPr>
           <w:rFonts w:eastAsiaTheme="minorEastAsia"/>
         </w:rPr>
+        <w:lastRenderedPageBreak/>
         <w:t>Future Work</w:t>
       </w:r>
       <w:bookmarkEnd w:id="30"/>
@@ -8568,13 +9070,6 @@
     <w:p>
       <w:pPr>
         <w:pStyle w:val="NormalWeb"/>
-        <w:rPr>
-          <w:rFonts w:asciiTheme="minorHAnsi" w:eastAsiaTheme="minorEastAsia" w:hAnsiTheme="minorHAnsi" w:cstheme="minorBidi"/>
-          <w:color w:val="00B050"/>
-          <w:lang w:eastAsia="en-US"/>
-        </w:rPr>
-      </w:pPr>
-      <w:r>
         <w:rPr>
           <w:rFonts w:asciiTheme="minorHAnsi" w:eastAsiaTheme="minorEastAsia" w:hAnsiTheme="minorHAnsi" w:cstheme="minorBidi"/>
           <w:b/>
@@ -8582,7 +9077,15 @@
           <w:color w:val="00B050"/>
           <w:lang w:eastAsia="en-US"/>
         </w:rPr>
-        <w:lastRenderedPageBreak/>
+      </w:pPr>
+      <w:r>
+        <w:rPr>
+          <w:rFonts w:asciiTheme="minorHAnsi" w:eastAsiaTheme="minorEastAsia" w:hAnsiTheme="minorHAnsi" w:cstheme="minorBidi"/>
+          <w:b/>
+          <w:bCs/>
+          <w:color w:val="00B050"/>
+          <w:lang w:eastAsia="en-US"/>
+        </w:rPr>
         <w:t>Structured Input → Target Representation Generation → Execution → Validation → Feedback</w:t>
       </w:r>
     </w:p>
@@ -8886,6 +9389,7 @@
           <w:rFonts w:asciiTheme="minorHAnsi" w:eastAsiaTheme="minorEastAsia" w:hAnsiTheme="minorHAnsi" w:cstheme="minorBidi"/>
           <w:lang w:eastAsia="en-US"/>
         </w:rPr>
+        <w:lastRenderedPageBreak/>
         <w:t>This flow emphasizes that the intelligence remains centralized in the LLM, while correctness and domain specificity are enforced externally.</w:t>
       </w:r>
     </w:p>
@@ -8905,7 +9409,7 @@
           <w:rFonts w:eastAsiaTheme="minorEastAsia"/>
         </w:rPr>
       </w:pPr>
-      <w:bookmarkStart w:id="31" w:name="_Toc220113143"/>
+      <w:bookmarkStart w:id="31" w:name="_Toc220173101"/>
       <w:r>
         <w:rPr>
           <w:rFonts w:eastAsiaTheme="minorEastAsia"/>
@@ -8943,7 +9447,6 @@
           <w:rFonts w:asciiTheme="minorHAnsi" w:eastAsiaTheme="minorEastAsia" w:hAnsiTheme="minorHAnsi" w:cstheme="minorBidi"/>
           <w:lang w:eastAsia="en-US"/>
         </w:rPr>
-        <w:lastRenderedPageBreak/>
         <w:t xml:space="preserve">The experimental results demonstrate that sequence-based models are insufficient for complex relational reasoning, while transformer-based and relation-aware architectures significantly improve Text-to-SQL performance. For SQL-to-NoSQL translation, schema-agnostic approaches fail to preserve semantic correctness, whereas schema-aware retrieval-augmented generation combined with execution-guided feedback leads to more reliable </w:t>
       </w:r>
       <w:proofErr w:type="spellStart"/>
@@ -9003,7 +9506,7 @@
           <w:rFonts w:eastAsiaTheme="minorEastAsia"/>
         </w:rPr>
       </w:pPr>
-      <w:bookmarkStart w:id="32" w:name="_Toc220113144"/>
+      <w:bookmarkStart w:id="32" w:name="_Toc220173102"/>
       <w:r>
         <w:rPr>
           <w:rFonts w:eastAsiaTheme="minorEastAsia"/>
@@ -9248,7 +9751,7 @@
                 <w:szCs w:val="24"/>
               </w:rPr>
             </w:pPr>
-            <w:hyperlink r:id="rId12" w:history="1">
+            <w:hyperlink r:id="rId15" w:history="1">
               <w:r>
                 <w:rPr>
                   <w:sz w:val="24"/>
@@ -9355,7 +9858,7 @@
                 <w:szCs w:val="24"/>
               </w:rPr>
             </w:pPr>
-            <w:hyperlink r:id="rId13" w:history="1">
+            <w:hyperlink r:id="rId16" w:history="1">
               <w:r>
                 <w:rPr>
                   <w:sz w:val="24"/>
@@ -9395,6 +9898,7 @@
                 <w:sz w:val="24"/>
                 <w:szCs w:val="24"/>
               </w:rPr>
+              <w:lastRenderedPageBreak/>
               <w:t>Dataset</w:t>
             </w:r>
           </w:p>
@@ -9462,7 +9966,7 @@
                 <w:szCs w:val="24"/>
               </w:rPr>
             </w:pPr>
-            <w:hyperlink r:id="rId14" w:history="1">
+            <w:hyperlink r:id="rId17" w:history="1">
               <w:r>
                 <w:rPr>
                   <w:sz w:val="24"/>
@@ -9569,7 +10073,7 @@
                 <w:szCs w:val="24"/>
               </w:rPr>
             </w:pPr>
-            <w:hyperlink r:id="rId15" w:history="1">
+            <w:hyperlink r:id="rId18" w:history="1">
               <w:r>
                 <w:rPr>
                   <w:sz w:val="24"/>
@@ -9676,7 +10180,7 @@
                 <w:szCs w:val="24"/>
               </w:rPr>
             </w:pPr>
-            <w:hyperlink r:id="rId16" w:history="1">
+            <w:hyperlink r:id="rId19" w:history="1">
               <w:r>
                 <w:rPr>
                   <w:sz w:val="24"/>
@@ -9693,10 +10197,10 @@
     <w:p/>
     <w:p/>
     <w:sectPr>
-      <w:headerReference w:type="default" r:id="rId17"/>
-      <w:footerReference w:type="even" r:id="rId18"/>
-      <w:footerReference w:type="default" r:id="rId19"/>
-      <w:footerReference w:type="first" r:id="rId20"/>
+      <w:headerReference w:type="default" r:id="rId20"/>
+      <w:footerReference w:type="even" r:id="rId21"/>
+      <w:footerReference w:type="default" r:id="rId22"/>
+      <w:footerReference w:type="first" r:id="rId23"/>
       <w:pgSz w:w="11906" w:h="16838"/>
       <w:pgMar w:top="1440" w:right="1440" w:bottom="1440" w:left="1440" w:header="708" w:footer="708" w:gutter="0"/>
       <w:cols w:space="708"/>
@@ -12161,7 +12665,6 @@
   <w:style w:type="character" w:default="1" w:styleId="DefaultParagraphFont">
     <w:name w:val="Default Paragraph Font"/>
     <w:uiPriority w:val="1"/>
-    <w:semiHidden/>
     <w:unhideWhenUsed/>
   </w:style>
   <w:style w:type="table" w:default="1" w:styleId="TableNormal">

</xml_diff>